<commit_message>
Add Topology Equipment IDs card and surface it in Packing List & Equipment
Simulation's Topology tab now has an "Equipment IDs — Main Set /
Backup Set" card for Power Supply, Tether, On-Deck Station, HCU and
Tablet, stored in sysarch.setEquipment (also fixes collectSimState/
loadSimulationState, which whitelist sysarch fields explicitly and
were silently dropping this without the fix). Project Data Log's
Equipment IDs table is now fully derived from Topology + Packing List
& Equipment with nothing manual left. The same live-derived table is
now also shown in the Packing List & Equipment tab itself, with an
Export Project Data Log button.

Co-Authored-By: Claude Sonnet 5 <noreply@anthropic.com>
</commit_message>
<xml_diff>
--- a/server/templates/ProjectDataLog.docx
+++ b/server/templates/ProjectDataLog.docx
@@ -775,6 +775,59 @@
                 <w:sz w:val="18"/>
                 <w:szCs w:val="18"/>
               </w:rPr>
+              <w:t xml:space="preserve">MiniSpector</w:t>
+            </w:r>
+          </w:p>
+        </w:tc>
+        <w:tc>
+          <w:tcPr>
+            <w:vAlign w:val="center"/>
+          </w:tcPr>
+          <w:p>
+            <w:pPr>
+              <w:jc w:val="center"/>
+            </w:pPr>
+            <w:r>
+              <w:rPr>
+                <w:sz w:val="18"/>
+                <w:szCs w:val="18"/>
+              </w:rPr>
+              <w:t xml:space="preserve">{mainMinispector}</w:t>
+            </w:r>
+          </w:p>
+        </w:tc>
+        <w:tc>
+          <w:tcPr>
+            <w:vAlign w:val="center"/>
+          </w:tcPr>
+          <w:p>
+            <w:pPr>
+              <w:jc w:val="center"/>
+            </w:pPr>
+            <w:r>
+              <w:rPr>
+                <w:sz w:val="18"/>
+                <w:szCs w:val="18"/>
+              </w:rPr>
+              <w:t xml:space="preserve">{backupMinispector}</w:t>
+            </w:r>
+          </w:p>
+        </w:tc>
+      </w:tr>
+      <w:tr>
+        <w:tc>
+          <w:tcPr>
+            <w:vAlign w:val="center"/>
+          </w:tcPr>
+          <w:p>
+            <w:pPr>
+              <w:jc w:val="center"/>
+            </w:pPr>
+            <w:r>
+              <w:rPr>
+                <w:sz w:val="18"/>
+                <w:szCs w:val="18"/>
+              </w:rPr>
               <w:t xml:space="preserve">Power Supply</w:t>
             </w:r>
           </w:p>
@@ -1022,159 +1075,6 @@
                 <w:szCs w:val="18"/>
               </w:rPr>
               <w:t xml:space="preserve">{backupTablet}</w:t>
-            </w:r>
-          </w:p>
-        </w:tc>
-      </w:tr>
-    </w:tbl>
-    <w:p>
-      <w:pPr>
-        <w:spacing w:after="100" w:before="240"/>
-      </w:pPr>
-      <w:r>
-        <w:rPr>
-          <w:b/>
-          <w:bCs/>
-          <w:sz w:val="20"/>
-          <w:szCs w:val="20"/>
-        </w:rPr>
-        <w:t xml:space="preserve">From Packing List &amp; Equipment</w:t>
-      </w:r>
-    </w:p>
-    <w:tbl>
-      <w:tblPr>
-        <w:tblW w:type="pct" w:w="100%"/>
-        <w:tblBorders>
-          <w:top w:val="single" w:color="auto" w:sz="4"/>
-          <w:left w:val="single" w:color="auto" w:sz="4"/>
-          <w:bottom w:val="single" w:color="auto" w:sz="4"/>
-          <w:right w:val="single" w:color="auto" w:sz="4"/>
-          <w:insideH w:val="single" w:color="auto" w:sz="4"/>
-          <w:insideV w:val="single" w:color="auto" w:sz="4"/>
-        </w:tblBorders>
-      </w:tblPr>
-      <w:tblGrid>
-        <w:gridCol w:w="100"/>
-        <w:gridCol w:w="100"/>
-        <w:gridCol w:w="100"/>
-      </w:tblGrid>
-      <w:tr>
-        <w:trPr>
-          <w:tblHeader/>
-        </w:trPr>
-        <w:tc>
-          <w:tcPr>
-            <w:shd w:fill="1F3864" w:val="clear"/>
-            <w:vAlign w:val="center"/>
-          </w:tcPr>
-          <w:p>
-            <w:pPr>
-              <w:jc w:val="center"/>
-            </w:pPr>
-            <w:r>
-              <w:rPr>
-                <w:b/>
-                <w:bCs/>
-                <w:color w:val="FFFFFF"/>
-                <w:sz w:val="18"/>
-                <w:szCs w:val="18"/>
-              </w:rPr>
-              <w:t xml:space="preserve">Item</w:t>
-            </w:r>
-          </w:p>
-        </w:tc>
-        <w:tc>
-          <w:tcPr>
-            <w:shd w:fill="1F3864" w:val="clear"/>
-            <w:vAlign w:val="center"/>
-          </w:tcPr>
-          <w:p>
-            <w:pPr>
-              <w:jc w:val="center"/>
-            </w:pPr>
-            <w:r>
-              <w:rPr>
-                <w:b/>
-                <w:bCs/>
-                <w:color w:val="FFFFFF"/>
-                <w:sz w:val="18"/>
-                <w:szCs w:val="18"/>
-              </w:rPr>
-              <w:t xml:space="preserve">Main Set ID</w:t>
-            </w:r>
-          </w:p>
-        </w:tc>
-        <w:tc>
-          <w:tcPr>
-            <w:shd w:fill="1F3864" w:val="clear"/>
-            <w:vAlign w:val="center"/>
-          </w:tcPr>
-          <w:p>
-            <w:pPr>
-              <w:jc w:val="center"/>
-            </w:pPr>
-            <w:r>
-              <w:rPr>
-                <w:b/>
-                <w:bCs/>
-                <w:color w:val="FFFFFF"/>
-                <w:sz w:val="18"/>
-                <w:szCs w:val="18"/>
-              </w:rPr>
-              <w:t xml:space="preserve">Backup Set ID</w:t>
-            </w:r>
-          </w:p>
-        </w:tc>
-      </w:tr>
-      <w:tr>
-        <w:tc>
-          <w:tcPr>
-            <w:vAlign w:val="center"/>
-          </w:tcPr>
-          <w:p>
-            <w:pPr>
-              <w:jc w:val="center"/>
-            </w:pPr>
-            <w:r>
-              <w:rPr>
-                <w:sz w:val="18"/>
-                <w:szCs w:val="18"/>
-              </w:rPr>
-              <w:t xml:space="preserve">MiniSpector</w:t>
-            </w:r>
-          </w:p>
-        </w:tc>
-        <w:tc>
-          <w:tcPr>
-            <w:vAlign w:val="center"/>
-          </w:tcPr>
-          <w:p>
-            <w:pPr>
-              <w:jc w:val="center"/>
-            </w:pPr>
-            <w:r>
-              <w:rPr>
-                <w:sz w:val="18"/>
-                <w:szCs w:val="18"/>
-              </w:rPr>
-              <w:t xml:space="preserve">{mainMinispector}</w:t>
-            </w:r>
-          </w:p>
-        </w:tc>
-        <w:tc>
-          <w:tcPr>
-            <w:vAlign w:val="center"/>
-          </w:tcPr>
-          <w:p>
-            <w:pPr>
-              <w:jc w:val="center"/>
-            </w:pPr>
-            <w:r>
-              <w:rPr>
-                <w:sz w:val="18"/>
-                <w:szCs w:val="18"/>
-              </w:rPr>
-              <w:t xml:space="preserve">{backupMinispector}</w:t>
             </w:r>
           </w:p>
         </w:tc>

</xml_diff>